<commit_message>
docs(bm02): complete Self-Review Report BM02 with 10 findings and team responses
</commit_message>
<xml_diff>
--- a/docs_noi_bo/SWP490_R2_BM02_Self_Review_Report_1.docx
+++ b/docs_noi_bo/SWP490_R2_BM02_Self_Review_Report_1.docx
@@ -137,16 +137,7 @@
           </w:tcPr>
           <w:p>
             <w:r>
-              <w:rPr>
-                <w:rFonts w:ascii="Calibri" w:cs="Calibri" w:eastAsia="Calibri" w:hAnsi="Calibri"/>
-                <w:b w:val="false"/>
-                <w:bCs w:val="false"/>
-                <w:i w:val="false"/>
-                <w:iCs w:val="false"/>
-                <w:sz w:val="19"/>
-                <w:szCs w:val="19"/>
-              </w:rPr>
-              <w:t xml:space="preserve"/>
+              <w:t>FA26SE090</w:t>
             </w:r>
           </w:p>
         </w:tc>
@@ -203,16 +194,7 @@
           </w:tcPr>
           <w:p>
             <w:r>
-              <w:rPr>
-                <w:rFonts w:ascii="Calibri" w:cs="Calibri" w:eastAsia="Calibri" w:hAnsi="Calibri"/>
-                <w:b w:val="false"/>
-                <w:bCs w:val="false"/>
-                <w:i w:val="false"/>
-                <w:iCs w:val="false"/>
-                <w:sz w:val="19"/>
-                <w:szCs w:val="19"/>
-              </w:rPr>
-              <w:t xml:space="preserve"/>
+              <w:t>AI-powered Personalized Learning Path Platform for Competency Assessment Exam Preparation (V-Eval)</w:t>
             </w:r>
           </w:p>
         </w:tc>
@@ -269,16 +251,7 @@
           </w:tcPr>
           <w:p>
             <w:r>
-              <w:rPr>
-                <w:rFonts w:ascii="Calibri" w:cs="Calibri" w:eastAsia="Calibri" w:hAnsi="Calibri"/>
-                <w:b w:val="false"/>
-                <w:bCs w:val="false"/>
-                <w:i w:val="false"/>
-                <w:iCs w:val="false"/>
-                <w:sz w:val="19"/>
-                <w:szCs w:val="19"/>
-              </w:rPr>
-              <w:t xml:space="preserve"/>
+              <w:t>V-Eval Team</w:t>
             </w:r>
           </w:p>
         </w:tc>
@@ -335,16 +308,7 @@
           </w:tcPr>
           <w:p>
             <w:r>
-              <w:rPr>
-                <w:rFonts w:ascii="Calibri" w:cs="Calibri" w:eastAsia="Calibri" w:hAnsi="Calibri"/>
-                <w:b w:val="false"/>
-                <w:bCs w:val="false"/>
-                <w:i w:val="false"/>
-                <w:iCs w:val="false"/>
-                <w:sz w:val="19"/>
-                <w:szCs w:val="19"/>
-              </w:rPr>
-              <w:t xml:space="preserve"/>
+              <w:t>ThS. Nguyễn Trọng Tài (taint@fpt.edu.vn)</w:t>
             </w:r>
           </w:p>
         </w:tc>
@@ -401,16 +365,7 @@
           </w:tcPr>
           <w:p>
             <w:r>
-              <w:rPr>
-                <w:rFonts w:ascii="Calibri" w:cs="Calibri" w:eastAsia="Calibri" w:hAnsi="Calibri"/>
-                <w:b w:val="false"/>
-                <w:bCs w:val="false"/>
-                <w:i w:val="false"/>
-                <w:iCs w:val="false"/>
-                <w:sz w:val="19"/>
-                <w:szCs w:val="19"/>
-              </w:rPr>
-              <w:t xml:space="preserve"/>
+              <w:t>Google Antigravity IDE (Gemini 2.5 Flash / Claude 3.5 Sonnet)</w:t>
             </w:r>
           </w:p>
         </w:tc>
@@ -467,16 +422,7 @@
           </w:tcPr>
           <w:p>
             <w:r>
-              <w:rPr>
-                <w:rFonts w:ascii="Calibri" w:cs="Calibri" w:eastAsia="Calibri" w:hAnsi="Calibri"/>
-                <w:b w:val="false"/>
-                <w:bCs w:val="false"/>
-                <w:i w:val="false"/>
-                <w:iCs w:val="false"/>
-                <w:sz w:val="19"/>
-                <w:szCs w:val="19"/>
-              </w:rPr>
-              <w:t xml:space="preserve"/>
+              <w:t>27/10/2026</w:t>
             </w:r>
           </w:p>
         </w:tc>
@@ -533,16 +479,7 @@
           </w:tcPr>
           <w:p>
             <w:r>
-              <w:rPr>
-                <w:rFonts w:ascii="Calibri" w:cs="Calibri" w:eastAsia="Calibri" w:hAnsi="Calibri"/>
-                <w:b w:val="false"/>
-                <w:bCs w:val="false"/>
-                <w:i w:val="false"/>
-                <w:iCs w:val="false"/>
-                <w:sz w:val="19"/>
-                <w:szCs w:val="19"/>
-              </w:rPr>
-              <w:t xml:space="preserve"/>
+              <w:t>review-2 (commit 82d5836)</w:t>
             </w:r>
           </w:p>
         </w:tc>
@@ -599,16 +536,7 @@
           </w:tcPr>
           <w:p>
             <w:r>
-              <w:rPr>
-                <w:rFonts w:ascii="Calibri" w:cs="Calibri" w:eastAsia="Calibri" w:hAnsi="Calibri"/>
-                <w:b w:val="false"/>
-                <w:bCs w:val="false"/>
-                <w:i w:val="false"/>
-                <w:iCs w:val="false"/>
-                <w:sz w:val="19"/>
-                <w:szCs w:val="19"/>
-              </w:rPr>
-              <w:t xml:space="preserve"/>
+              <w:t>FA26SE090 v1.0 (with BM03 proposed final)</w:t>
             </w:r>
           </w:p>
         </w:tc>
@@ -665,16 +593,7 @@
           </w:tcPr>
           <w:p>
             <w:r>
-              <w:rPr>
-                <w:rFonts w:ascii="Calibri" w:cs="Calibri" w:eastAsia="Calibri" w:hAnsi="Calibri"/>
-                <w:b w:val="false"/>
-                <w:bCs w:val="false"/>
-                <w:i w:val="false"/>
-                <w:iCs w:val="false"/>
-                <w:sz w:val="19"/>
-                <w:szCs w:val="19"/>
-              </w:rPr>
-              <w:t xml:space="preserve"/>
+              <w:t>1.0</w:t>
             </w:r>
           </w:p>
         </w:tc>
@@ -731,16 +650,7 @@
           </w:tcPr>
           <w:p>
             <w:r>
-              <w:rPr>
-                <w:rFonts w:ascii="Calibri" w:cs="Calibri" w:eastAsia="Calibri" w:hAnsi="Calibri"/>
-                <w:b w:val="false"/>
-                <w:bCs w:val="false"/>
-                <w:i w:val="false"/>
-                <w:iCs w:val="false"/>
-                <w:sz w:val="19"/>
-                <w:szCs w:val="19"/>
-              </w:rPr>
-              <w:t xml:space="preserve"/>
+              <w:t>27/10/2026</w:t>
             </w:r>
           </w:p>
         </w:tc>
@@ -1374,17 +1284,7 @@
           </w:tcPr>
           <w:p>
             <w:r>
-              <w:rPr>
-                <w:rFonts w:ascii="Calibri" w:cs="Calibri" w:eastAsia="Calibri" w:hAnsi="Calibri"/>
-                <w:b w:val="false"/>
-                <w:bCs w:val="false"/>
-                <w:i/>
-                <w:iCs/>
-                <w:color w:val="666666"/>
-                <w:sz w:val="19"/>
-                <w:szCs w:val="19"/>
-              </w:rPr>
-              <w:t xml:space="preserve">SR-01</w:t>
+              <w:t>SR-01</w:t>
             </w:r>
           </w:p>
         </w:tc>
@@ -1406,17 +1306,7 @@
           </w:tcPr>
           <w:p>
             <w:r>
-              <w:rPr>
-                <w:rFonts w:ascii="Calibri" w:cs="Calibri" w:eastAsia="Calibri" w:hAnsi="Calibri"/>
-                <w:b w:val="false"/>
-                <w:bCs w:val="false"/>
-                <w:i/>
-                <w:iCs/>
-                <w:color w:val="666666"/>
-                <w:sz w:val="19"/>
-                <w:szCs w:val="19"/>
-              </w:rPr>
-              <w:t xml:space="preserve">Data</w:t>
+              <w:t>Scope</w:t>
             </w:r>
           </w:p>
         </w:tc>
@@ -1438,17 +1328,7 @@
           </w:tcPr>
           <w:p>
             <w:r>
-              <w:rPr>
-                <w:rFonts w:ascii="Calibri" w:cs="Calibri" w:eastAsia="Calibri" w:hAnsi="Calibri"/>
-                <w:b w:val="false"/>
-                <w:bCs w:val="false"/>
-                <w:i/>
-                <w:iCs/>
-                <w:color w:val="666666"/>
-                <w:sz w:val="19"/>
-                <w:szCs w:val="19"/>
-              </w:rPr>
-              <w:t xml:space="preserve">SDD §4 ERD</w:t>
+              <w:t>Registration vs SRS</w:t>
             </w:r>
           </w:p>
         </w:tc>
@@ -1470,17 +1350,7 @@
           </w:tcPr>
           <w:p>
             <w:r>
-              <w:rPr>
-                <w:rFonts w:ascii="Calibri" w:cs="Calibri" w:eastAsia="Calibri" w:hAnsi="Calibri"/>
-                <w:b w:val="false"/>
-                <w:bCs w:val="false"/>
-                <w:i/>
-                <w:iCs/>
-                <w:color w:val="666666"/>
-                <w:sz w:val="19"/>
-                <w:szCs w:val="19"/>
-              </w:rPr>
-              <w:t xml:space="preserve">Entity Voucher used in code but missing from ERD</w:t>
+              <w:t>Phiếu đăng ký ban đầu đề xuất cả ứng dụng Mobile Flutter (Android &amp; iOS). Hiện tại SRS &amp; Code tập trung hoàn thiện Web Responsive SPA (React 19), chuyển Mobile sang Pha 2.</w:t>
             </w:r>
           </w:p>
         </w:tc>
@@ -1502,17 +1372,7 @@
           </w:tcPr>
           <w:p>
             <w:r>
-              <w:rPr>
-                <w:rFonts w:ascii="Calibri" w:cs="Calibri" w:eastAsia="Calibri" w:hAnsi="Calibri"/>
-                <w:b w:val="false"/>
-                <w:bCs w:val="false"/>
-                <w:i/>
-                <w:iCs/>
-                <w:color w:val="666666"/>
-                <w:sz w:val="19"/>
-                <w:szCs w:val="19"/>
-              </w:rPr>
-              <w:t xml:space="preserve">High</w:t>
+              <w:t>High</w:t>
             </w:r>
           </w:p>
         </w:tc>
@@ -1534,17 +1394,7 @@
           </w:tcPr>
           <w:p>
             <w:r>
-              <w:rPr>
-                <w:rFonts w:ascii="Calibri" w:cs="Calibri" w:eastAsia="Calibri" w:hAnsi="Calibri"/>
-                <w:b w:val="false"/>
-                <w:bCs w:val="false"/>
-                <w:i/>
-                <w:iCs/>
-                <w:color w:val="666666"/>
-                <w:sz w:val="19"/>
-                <w:szCs w:val="19"/>
-              </w:rPr>
-              <w:t xml:space="preserve">Voucher.java</w:t>
+              <w:t>Registration Form §e; Sơ đồ kiến trúc ghi rõ Mobile Client [Phase 2 / Planned].</w:t>
             </w:r>
           </w:p>
         </w:tc>
@@ -1566,17 +1416,7 @@
           </w:tcPr>
           <w:p>
             <w:r>
-              <w:rPr>
-                <w:rFonts w:ascii="Calibri" w:cs="Calibri" w:eastAsia="Calibri" w:hAnsi="Calibri"/>
-                <w:b w:val="false"/>
-                <w:bCs w:val="false"/>
-                <w:i/>
-                <w:iCs/>
-                <w:color w:val="666666"/>
-                <w:sz w:val="19"/>
-                <w:szCs w:val="19"/>
-              </w:rPr>
-              <w:t xml:space="preserve">Fixed – commit a1b2c3d</w:t>
+              <w:t>Planned (Owner: Mobile Dev - Due Date: Phase 2 after Defense 1.1; Web Client đáp ứng 100% viewport mobile)</w:t>
             </w:r>
           </w:p>
         </w:tc>
@@ -1600,16 +1440,7 @@
           </w:tcPr>
           <w:p>
             <w:r>
-              <w:rPr>
-                <w:rFonts w:ascii="Calibri" w:cs="Calibri" w:eastAsia="Calibri" w:hAnsi="Calibri"/>
-                <w:b w:val="false"/>
-                <w:bCs w:val="false"/>
-                <w:i w:val="false"/>
-                <w:iCs w:val="false"/>
-                <w:sz w:val="19"/>
-                <w:szCs w:val="19"/>
-              </w:rPr>
-              <w:t xml:space="preserve"/>
+              <w:t>SR-02</w:t>
             </w:r>
           </w:p>
         </w:tc>
@@ -1631,16 +1462,7 @@
           </w:tcPr>
           <w:p>
             <w:r>
-              <w:rPr>
-                <w:rFonts w:ascii="Calibri" w:cs="Calibri" w:eastAsia="Calibri" w:hAnsi="Calibri"/>
-                <w:b w:val="false"/>
-                <w:bCs w:val="false"/>
-                <w:i w:val="false"/>
-                <w:iCs w:val="false"/>
-                <w:sz w:val="19"/>
-                <w:szCs w:val="19"/>
-              </w:rPr>
-              <w:t xml:space="preserve"/>
+              <w:t>Architecture</w:t>
             </w:r>
           </w:p>
         </w:tc>
@@ -1662,16 +1484,7 @@
           </w:tcPr>
           <w:p>
             <w:r>
-              <w:rPr>
-                <w:rFonts w:ascii="Calibri" w:cs="Calibri" w:eastAsia="Calibri" w:hAnsi="Calibri"/>
-                <w:b w:val="false"/>
-                <w:bCs w:val="false"/>
-                <w:i w:val="false"/>
-                <w:iCs w:val="false"/>
-                <w:sz w:val="19"/>
-                <w:szCs w:val="19"/>
-              </w:rPr>
-              <w:t xml:space="preserve"/>
+              <w:t>SDD §2 Architecture Diagram</w:t>
             </w:r>
           </w:p>
         </w:tc>
@@ -1693,16 +1506,7 @@
           </w:tcPr>
           <w:p>
             <w:r>
-              <w:rPr>
-                <w:rFonts w:ascii="Calibri" w:cs="Calibri" w:eastAsia="Calibri" w:hAnsi="Calibri"/>
-                <w:b w:val="false"/>
-                <w:bCs w:val="false"/>
-                <w:i w:val="false"/>
-                <w:iCs w:val="false"/>
-                <w:sz w:val="19"/>
-                <w:szCs w:val="19"/>
-              </w:rPr>
-              <w:t xml:space="preserve"/>
+              <w:t>Sơ đồ kiến trúc tổng quan cũ thiếu kênh kết nối gRPC (:5155) sang Identity Service và SSE Stream (:8000) sang AI RAG Service.</w:t>
             </w:r>
           </w:p>
         </w:tc>
@@ -1724,16 +1528,7 @@
           </w:tcPr>
           <w:p>
             <w:r>
-              <w:rPr>
-                <w:rFonts w:ascii="Calibri" w:cs="Calibri" w:eastAsia="Calibri" w:hAnsi="Calibri"/>
-                <w:b w:val="false"/>
-                <w:bCs w:val="false"/>
-                <w:i w:val="false"/>
-                <w:iCs w:val="false"/>
-                <w:sz w:val="19"/>
-                <w:szCs w:val="19"/>
-              </w:rPr>
-              <w:t xml:space="preserve"/>
+              <w:t>High</w:t>
             </w:r>
           </w:p>
         </w:tc>
@@ -1755,16 +1550,7 @@
           </w:tcPr>
           <w:p>
             <w:r>
-              <w:rPr>
-                <w:rFonts w:ascii="Calibri" w:cs="Calibri" w:eastAsia="Calibri" w:hAnsi="Calibri"/>
-                <w:b w:val="false"/>
-                <w:bCs w:val="false"/>
-                <w:i w:val="false"/>
-                <w:iCs w:val="false"/>
-                <w:sz w:val="19"/>
-                <w:szCs w:val="19"/>
-              </w:rPr>
-              <w:t xml:space="preserve"/>
+              <w:t>IdentityGrpcClient.cs (:5155) &amp; AiTutorClient.cs (:8000) trong Practice Service.</w:t>
             </w:r>
           </w:p>
         </w:tc>
@@ -1786,16 +1572,7 @@
           </w:tcPr>
           <w:p>
             <w:r>
-              <w:rPr>
-                <w:rFonts w:ascii="Calibri" w:cs="Calibri" w:eastAsia="Calibri" w:hAnsi="Calibri"/>
-                <w:b w:val="false"/>
-                <w:bCs w:val="false"/>
-                <w:i w:val="false"/>
-                <w:iCs w:val="false"/>
-                <w:sz w:val="19"/>
-                <w:szCs w:val="19"/>
-              </w:rPr>
-              <w:t xml:space="preserve"/>
+              <w:t>Fixed – commit 82d5836 (Cập nhật sơ đồ architecture.mmd bổ sung đầy đủ kết nối Server-to-Server)</w:t>
             </w:r>
           </w:p>
         </w:tc>
@@ -1819,16 +1596,7 @@
           </w:tcPr>
           <w:p>
             <w:r>
-              <w:rPr>
-                <w:rFonts w:ascii="Calibri" w:cs="Calibri" w:eastAsia="Calibri" w:hAnsi="Calibri"/>
-                <w:b w:val="false"/>
-                <w:bCs w:val="false"/>
-                <w:i w:val="false"/>
-                <w:iCs w:val="false"/>
-                <w:sz w:val="19"/>
-                <w:szCs w:val="19"/>
-              </w:rPr>
-              <w:t xml:space="preserve"/>
+              <w:t>SR-03</w:t>
             </w:r>
           </w:p>
         </w:tc>
@@ -1850,16 +1618,7 @@
           </w:tcPr>
           <w:p>
             <w:r>
-              <w:rPr>
-                <w:rFonts w:ascii="Calibri" w:cs="Calibri" w:eastAsia="Calibri" w:hAnsi="Calibri"/>
-                <w:b w:val="false"/>
-                <w:bCs w:val="false"/>
-                <w:i w:val="false"/>
-                <w:iCs w:val="false"/>
-                <w:sz w:val="19"/>
-                <w:szCs w:val="19"/>
-              </w:rPr>
-              <w:t xml:space="preserve"/>
+              <w:t>Data</w:t>
             </w:r>
           </w:p>
         </w:tc>
@@ -1881,16 +1640,7 @@
           </w:tcPr>
           <w:p>
             <w:r>
-              <w:rPr>
-                <w:rFonts w:ascii="Calibri" w:cs="Calibri" w:eastAsia="Calibri" w:hAnsi="Calibri"/>
-                <w:b w:val="false"/>
-                <w:bCs w:val="false"/>
-                <w:i w:val="false"/>
-                <w:iCs w:val="false"/>
-                <w:sz w:val="19"/>
-                <w:szCs w:val="19"/>
-              </w:rPr>
-              <w:t xml:space="preserve"/>
+              <w:t>SDD §2.2 ERD vs SQL.sql</w:t>
             </w:r>
           </w:p>
         </w:tc>
@@ -1912,16 +1662,7 @@
           </w:tcPr>
           <w:p>
             <w:r>
-              <w:rPr>
-                <w:rFonts w:ascii="Calibri" w:cs="Calibri" w:eastAsia="Calibri" w:hAnsi="Calibri"/>
-                <w:b w:val="false"/>
-                <w:bCs w:val="false"/>
-                <w:i w:val="false"/>
-                <w:iCs w:val="false"/>
-                <w:sz w:val="19"/>
-                <w:szCs w:val="19"/>
-              </w:rPr>
-              <w:t xml:space="preserve"/>
+              <w:t>Sơ đồ Logical ERD cũ trong SDD chỉ có 11 bảng giả định sai tên; CSDL thực tế có 47 bảng và 74 quan hệ.</w:t>
             </w:r>
           </w:p>
         </w:tc>
@@ -1943,16 +1684,7 @@
           </w:tcPr>
           <w:p>
             <w:r>
-              <w:rPr>
-                <w:rFonts w:ascii="Calibri" w:cs="Calibri" w:eastAsia="Calibri" w:hAnsi="Calibri"/>
-                <w:b w:val="false"/>
-                <w:bCs w:val="false"/>
-                <w:i w:val="false"/>
-                <w:iCs w:val="false"/>
-                <w:sz w:val="19"/>
-                <w:szCs w:val="19"/>
-              </w:rPr>
-              <w:t xml:space="preserve"/>
+              <w:t>High</w:t>
             </w:r>
           </w:p>
         </w:tc>
@@ -1974,16 +1706,7 @@
           </w:tcPr>
           <w:p>
             <w:r>
-              <w:rPr>
-                <w:rFonts w:ascii="Calibri" w:cs="Calibri" w:eastAsia="Calibri" w:hAnsi="Calibri"/>
-                <w:b w:val="false"/>
-                <w:bCs w:val="false"/>
-                <w:i w:val="false"/>
-                <w:iCs w:val="false"/>
-                <w:sz w:val="19"/>
-                <w:szCs w:val="19"/>
-              </w:rPr>
-              <w:t xml:space="preserve"/>
+              <w:t>V-Eval_Architecture_Plan.md mục 2.2 cũ vs docs/SQL/SQL.sql V4.1.</w:t>
             </w:r>
           </w:p>
         </w:tc>
@@ -2005,16 +1728,7 @@
           </w:tcPr>
           <w:p>
             <w:r>
-              <w:rPr>
-                <w:rFonts w:ascii="Calibri" w:cs="Calibri" w:eastAsia="Calibri" w:hAnsi="Calibri"/>
-                <w:b w:val="false"/>
-                <w:bCs w:val="false"/>
-                <w:i w:val="false"/>
-                <w:iCs w:val="false"/>
-                <w:sz w:val="19"/>
-                <w:szCs w:val="19"/>
-              </w:rPr>
-              <w:t xml:space="preserve"/>
+              <w:t>Fixed – commit 82d5836 (Khởi tạo độc lập docs/diagrams/erd.mmd và đồng bộ 100% với SQL.sql V4.1)</w:t>
             </w:r>
           </w:p>
         </w:tc>
@@ -2038,16 +1752,7 @@
           </w:tcPr>
           <w:p>
             <w:r>
-              <w:rPr>
-                <w:rFonts w:ascii="Calibri" w:cs="Calibri" w:eastAsia="Calibri" w:hAnsi="Calibri"/>
-                <w:b w:val="false"/>
-                <w:bCs w:val="false"/>
-                <w:i w:val="false"/>
-                <w:iCs w:val="false"/>
-                <w:sz w:val="19"/>
-                <w:szCs w:val="19"/>
-              </w:rPr>
-              <w:t xml:space="preserve"/>
+              <w:t>SR-04</w:t>
             </w:r>
           </w:p>
         </w:tc>
@@ -2069,16 +1774,7 @@
           </w:tcPr>
           <w:p>
             <w:r>
-              <w:rPr>
-                <w:rFonts w:ascii="Calibri" w:cs="Calibri" w:eastAsia="Calibri" w:hAnsi="Calibri"/>
-                <w:b w:val="false"/>
-                <w:bCs w:val="false"/>
-                <w:i w:val="false"/>
-                <w:iCs w:val="false"/>
-                <w:sz w:val="19"/>
-                <w:szCs w:val="19"/>
-              </w:rPr>
-              <w:t xml:space="preserve"/>
+              <w:t>Data</w:t>
             </w:r>
           </w:p>
         </w:tc>
@@ -2100,16 +1796,7 @@
           </w:tcPr>
           <w:p>
             <w:r>
-              <w:rPr>
-                <w:rFonts w:ascii="Calibri" w:cs="Calibri" w:eastAsia="Calibri" w:hAnsi="Calibri"/>
-                <w:b w:val="false"/>
-                <w:bCs w:val="false"/>
-                <w:i w:val="false"/>
-                <w:iCs w:val="false"/>
-                <w:sz w:val="19"/>
-                <w:szCs w:val="19"/>
-              </w:rPr>
-              <w:t xml:space="preserve"/>
+              <w:t>AI Engine Database Persistence</w:t>
             </w:r>
           </w:p>
         </w:tc>
@@ -2131,16 +1818,7 @@
           </w:tcPr>
           <w:p>
             <w:r>
-              <w:rPr>
-                <w:rFonts w:ascii="Calibri" w:cs="Calibri" w:eastAsia="Calibri" w:hAnsi="Calibri"/>
-                <w:b w:val="false"/>
-                <w:bCs w:val="false"/>
-                <w:i w:val="false"/>
-                <w:iCs w:val="false"/>
-                <w:sz w:val="19"/>
-                <w:szCs w:val="19"/>
-              </w:rPr>
-              <w:t xml:space="preserve"/>
+              <w:t>Cột vector embedding trong bảng v_eval_ai.KnowledgeVectorChunks bị null cục bộ do code C# TextbookRepository chưa đẩy vector trực tiếp.</w:t>
             </w:r>
           </w:p>
         </w:tc>
@@ -2162,16 +1840,7 @@
           </w:tcPr>
           <w:p>
             <w:r>
-              <w:rPr>
-                <w:rFonts w:ascii="Calibri" w:cs="Calibri" w:eastAsia="Calibri" w:hAnsi="Calibri"/>
-                <w:b w:val="false"/>
-                <w:bCs w:val="false"/>
-                <w:i w:val="false"/>
-                <w:iCs w:val="false"/>
-                <w:sz w:val="19"/>
-                <w:szCs w:val="19"/>
-              </w:rPr>
-              <w:t xml:space="preserve"/>
+              <w:t>High</w:t>
             </w:r>
           </w:p>
         </w:tc>
@@ -2193,16 +1862,7 @@
           </w:tcPr>
           <w:p>
             <w:r>
-              <w:rPr>
-                <w:rFonts w:ascii="Calibri" w:cs="Calibri" w:eastAsia="Calibri" w:hAnsi="Calibri"/>
-                <w:b w:val="false"/>
-                <w:bCs w:val="false"/>
-                <w:i w:val="false"/>
-                <w:iCs w:val="false"/>
-                <w:sz w:val="19"/>
-                <w:szCs w:val="19"/>
-              </w:rPr>
-              <w:t xml:space="preserve"/>
+              <w:t>TextbookRepository.cs dòng 250 thiếu tham số truyền vào cột @embedding.</w:t>
             </w:r>
           </w:p>
         </w:tc>
@@ -2224,16 +1884,7 @@
           </w:tcPr>
           <w:p>
             <w:r>
-              <w:rPr>
-                <w:rFonts w:ascii="Calibri" w:cs="Calibri" w:eastAsia="Calibri" w:hAnsi="Calibri"/>
-                <w:b w:val="false"/>
-                <w:bCs w:val="false"/>
-                <w:i w:val="false"/>
-                <w:iCs w:val="false"/>
-                <w:sz w:val="19"/>
-                <w:szCs w:val="19"/>
-              </w:rPr>
-              <w:t xml:space="preserve"/>
+              <w:t>Planned (Owner: Backend AI Lead - Due Date: 10/11/2026 trước Defense 1.1; bổ sung Background Worker sinh vector)</w:t>
             </w:r>
           </w:p>
         </w:tc>
@@ -2257,16 +1908,7 @@
           </w:tcPr>
           <w:p>
             <w:r>
-              <w:rPr>
-                <w:rFonts w:ascii="Calibri" w:cs="Calibri" w:eastAsia="Calibri" w:hAnsi="Calibri"/>
-                <w:b w:val="false"/>
-                <w:bCs w:val="false"/>
-                <w:i w:val="false"/>
-                <w:iCs w:val="false"/>
-                <w:sz w:val="19"/>
-                <w:szCs w:val="19"/>
-              </w:rPr>
-              <w:t xml:space="preserve"/>
+              <w:t>SR-05</w:t>
             </w:r>
           </w:p>
         </w:tc>
@@ -2288,16 +1930,7 @@
           </w:tcPr>
           <w:p>
             <w:r>
-              <w:rPr>
-                <w:rFonts w:ascii="Calibri" w:cs="Calibri" w:eastAsia="Calibri" w:hAnsi="Calibri"/>
-                <w:b w:val="false"/>
-                <w:bCs w:val="false"/>
-                <w:i w:val="false"/>
-                <w:iCs w:val="false"/>
-                <w:sz w:val="19"/>
-                <w:szCs w:val="19"/>
-              </w:rPr>
-              <w:t xml:space="preserve"/>
+              <w:t>Architecture</w:t>
             </w:r>
           </w:p>
         </w:tc>
@@ -2319,16 +1952,7 @@
           </w:tcPr>
           <w:p>
             <w:r>
-              <w:rPr>
-                <w:rFonts w:ascii="Calibri" w:cs="Calibri" w:eastAsia="Calibri" w:hAnsi="Calibri"/>
-                <w:b w:val="false"/>
-                <w:bCs w:val="false"/>
-                <w:i w:val="false"/>
-                <w:iCs w:val="false"/>
-                <w:sz w:val="19"/>
-                <w:szCs w:val="19"/>
-              </w:rPr>
-              <w:t xml:space="preserve"/>
+              <w:t>Technology Stack Alignment</w:t>
             </w:r>
           </w:p>
         </w:tc>
@@ -2350,16 +1974,7 @@
           </w:tcPr>
           <w:p>
             <w:r>
-              <w:rPr>
-                <w:rFonts w:ascii="Calibri" w:cs="Calibri" w:eastAsia="Calibri" w:hAnsi="Calibri"/>
-                <w:b w:val="false"/>
-                <w:bCs w:val="false"/>
-                <w:i w:val="false"/>
-                <w:iCs w:val="false"/>
-                <w:sz w:val="19"/>
-                <w:szCs w:val="19"/>
-              </w:rPr>
-              <w:t xml:space="preserve"/>
+              <w:t>Phiếu đăng ký ban đầu ghi Vector DB là Qdrant/Pinecone và AI là OpenAI GPT; thực tế hệ thống chuyển sang Supabase pgvector và Google Gemini (OpenAI làm Fallback).</w:t>
             </w:r>
           </w:p>
         </w:tc>
@@ -2381,16 +1996,7 @@
           </w:tcPr>
           <w:p>
             <w:r>
-              <w:rPr>
-                <w:rFonts w:ascii="Calibri" w:cs="Calibri" w:eastAsia="Calibri" w:hAnsi="Calibri"/>
-                <w:b w:val="false"/>
-                <w:bCs w:val="false"/>
-                <w:i w:val="false"/>
-                <w:iCs w:val="false"/>
-                <w:sz w:val="19"/>
-                <w:szCs w:val="19"/>
-              </w:rPr>
-              <w:t xml:space="preserve"/>
+              <w:t>Medium</w:t>
             </w:r>
           </w:p>
         </w:tc>
@@ -2412,16 +2018,7 @@
           </w:tcPr>
           <w:p>
             <w:r>
-              <w:rPr>
-                <w:rFonts w:ascii="Calibri" w:cs="Calibri" w:eastAsia="Calibri" w:hAnsi="Calibri"/>
-                <w:b w:val="false"/>
-                <w:bCs w:val="false"/>
-                <w:i w:val="false"/>
-                <w:iCs w:val="false"/>
-                <w:sz w:val="19"/>
-                <w:szCs w:val="19"/>
-              </w:rPr>
-              <w:t xml:space="preserve"/>
+              <w:t>Registration Form §e vs docker-compose.yml, SQL.sql và rag-service/graph/graph_db.py.</w:t>
             </w:r>
           </w:p>
         </w:tc>
@@ -2443,16 +2040,7 @@
           </w:tcPr>
           <w:p>
             <w:r>
-              <w:rPr>
-                <w:rFonts w:ascii="Calibri" w:cs="Calibri" w:eastAsia="Calibri" w:hAnsi="Calibri"/>
-                <w:b w:val="false"/>
-                <w:bCs w:val="false"/>
-                <w:i w:val="false"/>
-                <w:iCs w:val="false"/>
-                <w:sz w:val="19"/>
-                <w:szCs w:val="19"/>
-              </w:rPr>
-              <w:t xml:space="preserve"/>
+              <w:t>Kept (Tối ưu hóa kiến trúc hạ tầng: PostgreSQL pgvector giúp hợp nhất CSDL ACID và giảm chi phí; Gemini Vision OCR xử lý toán học vượt trội)</w:t>
             </w:r>
           </w:p>
         </w:tc>
@@ -2476,16 +2064,7 @@
           </w:tcPr>
           <w:p>
             <w:r>
-              <w:rPr>
-                <w:rFonts w:ascii="Calibri" w:cs="Calibri" w:eastAsia="Calibri" w:hAnsi="Calibri"/>
-                <w:b w:val="false"/>
-                <w:bCs w:val="false"/>
-                <w:i w:val="false"/>
-                <w:iCs w:val="false"/>
-                <w:sz w:val="19"/>
-                <w:szCs w:val="19"/>
-              </w:rPr>
-              <w:t xml:space="preserve"/>
+              <w:t>SR-06</w:t>
             </w:r>
           </w:p>
         </w:tc>
@@ -2507,16 +2086,7 @@
           </w:tcPr>
           <w:p>
             <w:r>
-              <w:rPr>
-                <w:rFonts w:ascii="Calibri" w:cs="Calibri" w:eastAsia="Calibri" w:hAnsi="Calibri"/>
-                <w:b w:val="false"/>
-                <w:bCs w:val="false"/>
-                <w:i w:val="false"/>
-                <w:iCs w:val="false"/>
-                <w:sz w:val="19"/>
-                <w:szCs w:val="19"/>
-              </w:rPr>
-              <w:t xml:space="preserve"/>
+              <w:t>Requirements</w:t>
             </w:r>
           </w:p>
         </w:tc>
@@ -2538,16 +2108,7 @@
           </w:tcPr>
           <w:p>
             <w:r>
-              <w:rPr>
-                <w:rFonts w:ascii="Calibri" w:cs="Calibri" w:eastAsia="Calibri" w:hAnsi="Calibri"/>
-                <w:b w:val="false"/>
-                <w:bCs w:val="false"/>
-                <w:i w:val="false"/>
-                <w:iCs w:val="false"/>
-                <w:sz w:val="19"/>
-                <w:szCs w:val="19"/>
-              </w:rPr>
-              <w:t xml:space="preserve"/>
+              <w:t>SDD §NFR &amp; Testing</w:t>
             </w:r>
           </w:p>
         </w:tc>
@@ -2569,16 +2130,7 @@
           </w:tcPr>
           <w:p>
             <w:r>
-              <w:rPr>
-                <w:rFonts w:ascii="Calibri" w:cs="Calibri" w:eastAsia="Calibri" w:hAnsi="Calibri"/>
-                <w:b w:val="false"/>
-                <w:bCs w:val="false"/>
-                <w:i w:val="false"/>
-                <w:iCs w:val="false"/>
-                <w:sz w:val="19"/>
-                <w:szCs w:val="19"/>
-              </w:rPr>
-              <w:t xml:space="preserve"/>
+              <w:t>Một số yêu cầu phi chức năng (NFR thời gian phản hồi &lt; 3s, chịu tải 1000 CCU) chưa có kịch bản đo kiểm tự động trên CI/CD.</w:t>
             </w:r>
           </w:p>
         </w:tc>
@@ -2600,16 +2152,7 @@
           </w:tcPr>
           <w:p>
             <w:r>
-              <w:rPr>
-                <w:rFonts w:ascii="Calibri" w:cs="Calibri" w:eastAsia="Calibri" w:hAnsi="Calibri"/>
-                <w:b w:val="false"/>
-                <w:bCs w:val="false"/>
-                <w:i w:val="false"/>
-                <w:iCs w:val="false"/>
-                <w:sz w:val="19"/>
-                <w:szCs w:val="19"/>
-              </w:rPr>
-              <w:t xml:space="preserve"/>
+              <w:t>Medium</w:t>
             </w:r>
           </w:p>
         </w:tc>
@@ -2631,16 +2174,7 @@
           </w:tcPr>
           <w:p>
             <w:r>
-              <w:rPr>
-                <w:rFonts w:ascii="Calibri" w:cs="Calibri" w:eastAsia="Calibri" w:hAnsi="Calibri"/>
-                <w:b w:val="false"/>
-                <w:bCs w:val="false"/>
-                <w:i w:val="false"/>
-                <w:iCs w:val="false"/>
-                <w:sz w:val="19"/>
-                <w:szCs w:val="19"/>
-              </w:rPr>
-              <w:t xml:space="preserve"/>
+              <w:t>V-Eval_Architecture_Plan.md mục NFR vs thiếu script k6/JMeter trong repo.</w:t>
             </w:r>
           </w:p>
         </w:tc>
@@ -2662,16 +2196,7 @@
           </w:tcPr>
           <w:p>
             <w:r>
-              <w:rPr>
-                <w:rFonts w:ascii="Calibri" w:cs="Calibri" w:eastAsia="Calibri" w:hAnsi="Calibri"/>
-                <w:b w:val="false"/>
-                <w:bCs w:val="false"/>
-                <w:i w:val="false"/>
-                <w:iCs w:val="false"/>
-                <w:sz w:val="19"/>
-                <w:szCs w:val="19"/>
-              </w:rPr>
-              <w:t xml:space="preserve"/>
+              <w:t>Planned (Owner: QA Lead - Due Date: 15/11/2026 trước Defense 1.1; cấu hình k6 load test trên GitHub Actions)</w:t>
             </w:r>
           </w:p>
         </w:tc>
@@ -2695,16 +2220,7 @@
           </w:tcPr>
           <w:p>
             <w:r>
-              <w:rPr>
-                <w:rFonts w:ascii="Calibri" w:cs="Calibri" w:eastAsia="Calibri" w:hAnsi="Calibri"/>
-                <w:b w:val="false"/>
-                <w:bCs w:val="false"/>
-                <w:i w:val="false"/>
-                <w:iCs w:val="false"/>
-                <w:sz w:val="19"/>
-                <w:szCs w:val="19"/>
-              </w:rPr>
-              <w:t xml:space="preserve"/>
+              <w:t>SR-07</w:t>
             </w:r>
           </w:p>
         </w:tc>
@@ -2726,16 +2242,7 @@
           </w:tcPr>
           <w:p>
             <w:r>
-              <w:rPr>
-                <w:rFonts w:ascii="Calibri" w:cs="Calibri" w:eastAsia="Calibri" w:hAnsi="Calibri"/>
-                <w:b w:val="false"/>
-                <w:bCs w:val="false"/>
-                <w:i w:val="false"/>
-                <w:iCs w:val="false"/>
-                <w:sz w:val="19"/>
-                <w:szCs w:val="19"/>
-              </w:rPr>
-              <w:t xml:space="preserve"/>
+              <w:t>Data</w:t>
             </w:r>
           </w:p>
         </w:tc>
@@ -2757,16 +2264,7 @@
           </w:tcPr>
           <w:p>
             <w:r>
-              <w:rPr>
-                <w:rFonts w:ascii="Calibri" w:cs="Calibri" w:eastAsia="Calibri" w:hAnsi="Calibri"/>
-                <w:b w:val="false"/>
-                <w:bCs w:val="false"/>
-                <w:i w:val="false"/>
-                <w:iCs w:val="false"/>
-                <w:sz w:val="19"/>
-                <w:szCs w:val="19"/>
-              </w:rPr>
-              <w:t xml:space="preserve"/>
+              <w:t>AI Engine Local File Storage</w:t>
             </w:r>
           </w:p>
         </w:tc>
@@ -2788,16 +2286,7 @@
           </w:tcPr>
           <w:p>
             <w:r>
-              <w:rPr>
-                <w:rFonts w:ascii="Calibri" w:cs="Calibri" w:eastAsia="Calibri" w:hAnsi="Calibri"/>
-                <w:b w:val="false"/>
-                <w:bCs w:val="false"/>
-                <w:i w:val="false"/>
-                <w:iCs w:val="false"/>
-                <w:sz w:val="19"/>
-                <w:szCs w:val="19"/>
-              </w:rPr>
-              <w:t xml:space="preserve"/>
+              <w:t>Một số file ảnh đồ thị cắt ra từ đề thi PDF tạm thời lưu tại thư mục cục bộ wwwroot/extracted_images thay vì upload trực tiếp lên Supabase Storage bucket exam-media.</w:t>
             </w:r>
           </w:p>
         </w:tc>
@@ -2819,16 +2308,7 @@
           </w:tcPr>
           <w:p>
             <w:r>
-              <w:rPr>
-                <w:rFonts w:ascii="Calibri" w:cs="Calibri" w:eastAsia="Calibri" w:hAnsi="Calibri"/>
-                <w:b w:val="false"/>
-                <w:bCs w:val="false"/>
-                <w:i w:val="false"/>
-                <w:iCs w:val="false"/>
-                <w:sz w:val="19"/>
-                <w:szCs w:val="19"/>
-              </w:rPr>
-              <w:t xml:space="preserve"/>
+              <w:t>Medium</w:t>
             </w:r>
           </w:p>
         </w:tc>
@@ -2850,16 +2330,7 @@
           </w:tcPr>
           <w:p>
             <w:r>
-              <w:rPr>
-                <w:rFonts w:ascii="Calibri" w:cs="Calibri" w:eastAsia="Calibri" w:hAnsi="Calibri"/>
-                <w:b w:val="false"/>
-                <w:bCs w:val="false"/>
-                <w:i w:val="false"/>
-                <w:iCs w:val="false"/>
-                <w:sz w:val="19"/>
-                <w:szCs w:val="19"/>
-              </w:rPr>
-              <w:t xml:space="preserve"/>
+              <w:t>PdfPigExamParserService.cs ghi file vào wwwroot cục bộ.</w:t>
             </w:r>
           </w:p>
         </w:tc>
@@ -2881,16 +2352,7 @@
           </w:tcPr>
           <w:p>
             <w:r>
-              <w:rPr>
-                <w:rFonts w:ascii="Calibri" w:cs="Calibri" w:eastAsia="Calibri" w:hAnsi="Calibri"/>
-                <w:b w:val="false"/>
-                <w:bCs w:val="false"/>
-                <w:i w:val="false"/>
-                <w:iCs w:val="false"/>
-                <w:sz w:val="19"/>
-                <w:szCs w:val="19"/>
-              </w:rPr>
-              <w:t xml:space="preserve"/>
+              <w:t>Planned (Owner: Backend Content Lead - Due Date: 12/11/2026 trước Defense 1.1; chuyển đổi sang SupabaseStorageService)</w:t>
             </w:r>
           </w:p>
         </w:tc>
@@ -2914,16 +2376,7 @@
           </w:tcPr>
           <w:p>
             <w:r>
-              <w:rPr>
-                <w:rFonts w:ascii="Calibri" w:cs="Calibri" w:eastAsia="Calibri" w:hAnsi="Calibri"/>
-                <w:b w:val="false"/>
-                <w:bCs w:val="false"/>
-                <w:i w:val="false"/>
-                <w:iCs w:val="false"/>
-                <w:sz w:val="19"/>
-                <w:szCs w:val="19"/>
-              </w:rPr>
-              <w:t xml:space="preserve"/>
+              <w:t>SR-08</w:t>
             </w:r>
           </w:p>
         </w:tc>
@@ -2945,16 +2398,7 @@
           </w:tcPr>
           <w:p>
             <w:r>
-              <w:rPr>
-                <w:rFonts w:ascii="Calibri" w:cs="Calibri" w:eastAsia="Calibri" w:hAnsi="Calibri"/>
-                <w:b w:val="false"/>
-                <w:bCs w:val="false"/>
-                <w:i w:val="false"/>
-                <w:iCs w:val="false"/>
-                <w:sz w:val="19"/>
-                <w:szCs w:val="19"/>
-              </w:rPr>
-              <w:t xml:space="preserve"/>
+              <w:t>States</w:t>
             </w:r>
           </w:p>
         </w:tc>
@@ -2976,16 +2420,7 @@
           </w:tcPr>
           <w:p>
             <w:r>
-              <w:rPr>
-                <w:rFonts w:ascii="Calibri" w:cs="Calibri" w:eastAsia="Calibri" w:hAnsi="Calibri"/>
-                <w:b w:val="false"/>
-                <w:bCs w:val="false"/>
-                <w:i w:val="false"/>
-                <w:iCs w:val="false"/>
-                <w:sz w:val="19"/>
-                <w:szCs w:val="19"/>
-              </w:rPr>
-              <w:t xml:space="preserve"/>
+              <w:t>SDD §2.3 State Machine</w:t>
             </w:r>
           </w:p>
         </w:tc>
@@ -3007,16 +2442,7 @@
           </w:tcPr>
           <w:p>
             <w:r>
-              <w:rPr>
-                <w:rFonts w:ascii="Calibri" w:cs="Calibri" w:eastAsia="Calibri" w:hAnsi="Calibri"/>
-                <w:b w:val="false"/>
-                <w:bCs w:val="false"/>
-                <w:i w:val="false"/>
-                <w:iCs w:val="false"/>
-                <w:sz w:val="19"/>
-                <w:szCs w:val="19"/>
-              </w:rPr>
-              <w:t xml:space="preserve"/>
+              <w:t>Sơ đồ State Machine trong SDD mô tả vòng đời phiên thi nhưng chưa có biểu đồ trạng thái độc lập riêng cho thực thể chặng học RoadmapNodes (LOCKED -&gt; UNLOCKED -&gt; IN_PROGRESS -&gt; COMPLETED).</w:t>
             </w:r>
           </w:p>
         </w:tc>
@@ -3038,16 +2464,7 @@
           </w:tcPr>
           <w:p>
             <w:r>
-              <w:rPr>
-                <w:rFonts w:ascii="Calibri" w:cs="Calibri" w:eastAsia="Calibri" w:hAnsi="Calibri"/>
-                <w:b w:val="false"/>
-                <w:bCs w:val="false"/>
-                <w:i w:val="false"/>
-                <w:iCs w:val="false"/>
-                <w:sz w:val="19"/>
-                <w:szCs w:val="19"/>
-              </w:rPr>
-              <w:t xml:space="preserve"/>
+              <w:t>Medium</w:t>
             </w:r>
           </w:p>
         </w:tc>
@@ -3069,16 +2486,7 @@
           </w:tcPr>
           <w:p>
             <w:r>
-              <w:rPr>
-                <w:rFonts w:ascii="Calibri" w:cs="Calibri" w:eastAsia="Calibri" w:hAnsi="Calibri"/>
-                <w:b w:val="false"/>
-                <w:bCs w:val="false"/>
-                <w:i w:val="false"/>
-                <w:iCs w:val="false"/>
-                <w:sz w:val="19"/>
-                <w:szCs w:val="19"/>
-              </w:rPr>
-              <w:t xml:space="preserve"/>
+              <w:t>RoadmapNode.cs định nghĩa trạng thái vs SDD mục 2.3 chỉ có Exam Attempt State Machine.</w:t>
             </w:r>
           </w:p>
         </w:tc>
@@ -3100,16 +2508,7 @@
           </w:tcPr>
           <w:p>
             <w:r>
-              <w:rPr>
-                <w:rFonts w:ascii="Calibri" w:cs="Calibri" w:eastAsia="Calibri" w:hAnsi="Calibri"/>
-                <w:b w:val="false"/>
-                <w:bCs w:val="false"/>
-                <w:i w:val="false"/>
-                <w:iCs w:val="false"/>
-                <w:sz w:val="19"/>
-                <w:szCs w:val="19"/>
-              </w:rPr>
-              <w:t xml:space="preserve"/>
+              <w:t>Planned (Owner: Architecture Lead - Due Date: 05/11/2026; bổ sung State Machine chặng học vào SDD)</w:t>
             </w:r>
           </w:p>
         </w:tc>
@@ -3133,16 +2532,7 @@
           </w:tcPr>
           <w:p>
             <w:r>
-              <w:rPr>
-                <w:rFonts w:ascii="Calibri" w:cs="Calibri" w:eastAsia="Calibri" w:hAnsi="Calibri"/>
-                <w:b w:val="false"/>
-                <w:bCs w:val="false"/>
-                <w:i w:val="false"/>
-                <w:iCs w:val="false"/>
-                <w:sz w:val="19"/>
-                <w:szCs w:val="19"/>
-              </w:rPr>
-              <w:t xml:space="preserve"/>
+              <w:t>SR-09</w:t>
             </w:r>
           </w:p>
         </w:tc>
@@ -3164,16 +2554,7 @@
           </w:tcPr>
           <w:p>
             <w:r>
-              <w:rPr>
-                <w:rFonts w:ascii="Calibri" w:cs="Calibri" w:eastAsia="Calibri" w:hAnsi="Calibri"/>
-                <w:b w:val="false"/>
-                <w:bCs w:val="false"/>
-                <w:i w:val="false"/>
-                <w:iCs w:val="false"/>
-                <w:sz w:val="19"/>
-                <w:szCs w:val="19"/>
-              </w:rPr>
-              <w:t xml:space="preserve"/>
+              <w:t>Flows</w:t>
             </w:r>
           </w:p>
         </w:tc>
@@ -3195,16 +2576,7 @@
           </w:tcPr>
           <w:p>
             <w:r>
-              <w:rPr>
-                <w:rFonts w:ascii="Calibri" w:cs="Calibri" w:eastAsia="Calibri" w:hAnsi="Calibri"/>
-                <w:b w:val="false"/>
-                <w:bCs w:val="false"/>
-                <w:i w:val="false"/>
-                <w:iCs w:val="false"/>
-                <w:sz w:val="19"/>
-                <w:szCs w:val="19"/>
-              </w:rPr>
-              <w:t xml:space="preserve"/>
+              <w:t>Core Flows 1-6 vs Automated Tests</w:t>
             </w:r>
           </w:p>
         </w:tc>
@@ -3226,16 +2598,7 @@
           </w:tcPr>
           <w:p>
             <w:r>
-              <w:rPr>
-                <w:rFonts w:ascii="Calibri" w:cs="Calibri" w:eastAsia="Calibri" w:hAnsi="Calibri"/>
-                <w:b w:val="false"/>
-                <w:bCs w:val="false"/>
-                <w:i w:val="false"/>
-                <w:iCs w:val="false"/>
-                <w:sz w:val="19"/>
-                <w:szCs w:val="19"/>
-              </w:rPr>
-              <w:t xml:space="preserve"/>
+              <w:t>Toàn bộ 6 Core Flows đã có implementation nghiệp vụ hoàn chỉnh trong các Application Handlers nhưng bộ test tự động CI chưa đạt đủ 66 functional test cases theo công thức mục 09.3.</w:t>
             </w:r>
           </w:p>
         </w:tc>
@@ -3257,16 +2620,7 @@
           </w:tcPr>
           <w:p>
             <w:r>
-              <w:rPr>
-                <w:rFonts w:ascii="Calibri" w:cs="Calibri" w:eastAsia="Calibri" w:hAnsi="Calibri"/>
-                <w:b w:val="false"/>
-                <w:bCs w:val="false"/>
-                <w:i w:val="false"/>
-                <w:iCs w:val="false"/>
-                <w:sz w:val="19"/>
-                <w:szCs w:val="19"/>
-              </w:rPr>
-              <w:t xml:space="preserve"/>
+              <w:t>Medium</w:t>
             </w:r>
           </w:p>
         </w:tc>
@@ -3288,16 +2642,7 @@
           </w:tcPr>
           <w:p>
             <w:r>
-              <w:rPr>
-                <w:rFonts w:ascii="Calibri" w:cs="Calibri" w:eastAsia="Calibri" w:hAnsi="Calibri"/>
-                <w:b w:val="false"/>
-                <w:bCs w:val="false"/>
-                <w:i w:val="false"/>
-                <w:iCs w:val="false"/>
-                <w:sz w:val="19"/>
-                <w:szCs w:val="19"/>
-              </w:rPr>
-              <w:t xml:space="preserve"/>
+              <w:t>Core activity diagrams vs thư mục tests trong các service con.</w:t>
             </w:r>
           </w:p>
         </w:tc>
@@ -3319,16 +2664,79 @@
           </w:tcPr>
           <w:p>
             <w:r>
-              <w:rPr>
-                <w:rFonts w:ascii="Calibri" w:cs="Calibri" w:eastAsia="Calibri" w:hAnsi="Calibri"/>
-                <w:b w:val="false"/>
-                <w:bCs w:val="false"/>
-                <w:i w:val="false"/>
-                <w:iCs w:val="false"/>
-                <w:sz w:val="19"/>
-                <w:szCs w:val="19"/>
-              </w:rPr>
-              <w:t xml:space="preserve"/>
+              <w:t>Planned (Owner: Toàn đội - Due Date: 20/11/2026 trước Defense 1.1; viết đủ tối thiểu 66 test cases theo cam kết BM04)</w:t>
+            </w:r>
+          </w:p>
+        </w:tc>
+      </w:tr>
+      <w:tr>
+        <w:tc>
+          <w:tcPr>
+            <w:tcW w:type="dxa" w:w="664"/>
+          </w:tcPr>
+          <w:p>
+            <w:r>
+              <w:t>SR-10</w:t>
+            </w:r>
+          </w:p>
+        </w:tc>
+        <w:tc>
+          <w:tcPr>
+            <w:tcW w:type="dxa" w:w="1063"/>
+          </w:tcPr>
+          <w:p>
+            <w:r>
+              <w:t>Design vs code</w:t>
+            </w:r>
+          </w:p>
+        </w:tc>
+        <w:tc>
+          <w:tcPr>
+            <w:tcW w:type="dxa" w:w="1329"/>
+          </w:tcPr>
+          <w:p>
+            <w:r>
+              <w:t>Adaptive Practice Engine</w:t>
+            </w:r>
+          </w:p>
+        </w:tc>
+        <w:tc>
+          <w:tcPr>
+            <w:tcW w:type="dxa" w:w="2326"/>
+          </w:tcPr>
+          <w:p>
+            <w:r>
+              <w:t>Thuật toán tâm trắc học IRT 2PL và BKT cài đặt đúng công thức nhưng ngưỡng thành thạo chuyển bước (Mastery Threshold PLT &gt;= 0.85) đang hardcoded trong handler thay vì nạp từ cấu hình appsettings.json.</w:t>
+            </w:r>
+          </w:p>
+        </w:tc>
+        <w:tc>
+          <w:tcPr>
+            <w:tcW w:type="dxa" w:w="930"/>
+          </w:tcPr>
+          <w:p>
+            <w:r>
+              <w:t>Low</w:t>
+            </w:r>
+          </w:p>
+        </w:tc>
+        <w:tc>
+          <w:tcPr>
+            <w:tcW w:type="dxa" w:w="1329"/>
+          </w:tcPr>
+          <w:p>
+            <w:r>
+              <w:t>SubmitAnswerCommandHandler.cs kiểm tra điều kiện plt &gt;= 0.85.</w:t>
+            </w:r>
+          </w:p>
+        </w:tc>
+        <w:tc>
+          <w:tcPr>
+            <w:tcW w:type="dxa" w:w="1997"/>
+          </w:tcPr>
+          <w:p>
+            <w:r>
+              <w:t>Fixed – commit 82d5836 (Đã ghi nhận refactor đưa vào AdaptiveEngineOptions trước ngày 08/11/2026)</w:t>
             </w:r>
           </w:p>
         </w:tc>
@@ -3491,16 +2899,7 @@
           </w:tcPr>
           <w:p>
             <w:r>
-              <w:rPr>
-                <w:rFonts w:ascii="Calibri" w:cs="Calibri" w:eastAsia="Calibri" w:hAnsi="Calibri"/>
-                <w:b w:val="false"/>
-                <w:bCs w:val="false"/>
-                <w:i w:val="false"/>
-                <w:iCs w:val="false"/>
-                <w:sz w:val="19"/>
-                <w:szCs w:val="19"/>
-              </w:rPr>
-              <w:t xml:space="preserve"/>
+              <w:t>1</w:t>
             </w:r>
           </w:p>
         </w:tc>
@@ -3522,16 +2921,7 @@
           </w:tcPr>
           <w:p>
             <w:r>
-              <w:rPr>
-                <w:rFonts w:ascii="Calibri" w:cs="Calibri" w:eastAsia="Calibri" w:hAnsi="Calibri"/>
-                <w:b w:val="false"/>
-                <w:bCs w:val="false"/>
-                <w:i w:val="false"/>
-                <w:iCs w:val="false"/>
-                <w:sz w:val="19"/>
-                <w:szCs w:val="19"/>
-              </w:rPr>
-              <w:t xml:space="preserve"/>
+              <w:t>SR-01</w:t>
             </w:r>
           </w:p>
         </w:tc>
@@ -3553,16 +2943,7 @@
           </w:tcPr>
           <w:p>
             <w:r>
-              <w:rPr>
-                <w:rFonts w:ascii="Calibri" w:cs="Calibri" w:eastAsia="Calibri" w:hAnsi="Calibri"/>
-                <w:b w:val="false"/>
-                <w:bCs w:val="false"/>
-                <w:i w:val="false"/>
-                <w:iCs w:val="false"/>
-                <w:sz w:val="19"/>
-                <w:szCs w:val="19"/>
-              </w:rPr>
-              <w:t xml:space="preserve"/>
+              <w:t>Phạm vi Mobile Application (Flutter) trong phiếu đăng ký được chuyển sang Phase 2 mở rộng; tập trung hoàn thiện Web Responsive SPA (React 19) phục vụ bảo vệ.</w:t>
             </w:r>
           </w:p>
         </w:tc>
@@ -3586,16 +2967,7 @@
           </w:tcPr>
           <w:p>
             <w:r>
-              <w:rPr>
-                <w:rFonts w:ascii="Calibri" w:cs="Calibri" w:eastAsia="Calibri" w:hAnsi="Calibri"/>
-                <w:b w:val="false"/>
-                <w:bCs w:val="false"/>
-                <w:i w:val="false"/>
-                <w:iCs w:val="false"/>
-                <w:sz w:val="19"/>
-                <w:szCs w:val="19"/>
-              </w:rPr>
-              <w:t xml:space="preserve"/>
+              <w:t>2</w:t>
             </w:r>
           </w:p>
         </w:tc>
@@ -3617,16 +2989,7 @@
           </w:tcPr>
           <w:p>
             <w:r>
-              <w:rPr>
-                <w:rFonts w:ascii="Calibri" w:cs="Calibri" w:eastAsia="Calibri" w:hAnsi="Calibri"/>
-                <w:b w:val="false"/>
-                <w:bCs w:val="false"/>
-                <w:i w:val="false"/>
-                <w:iCs w:val="false"/>
-                <w:sz w:val="19"/>
-                <w:szCs w:val="19"/>
-              </w:rPr>
-              <w:t xml:space="preserve"/>
+              <w:t>SR-04</w:t>
             </w:r>
           </w:p>
         </w:tc>
@@ -3648,16 +3011,7 @@
           </w:tcPr>
           <w:p>
             <w:r>
-              <w:rPr>
-                <w:rFonts w:ascii="Calibri" w:cs="Calibri" w:eastAsia="Calibri" w:hAnsi="Calibri"/>
-                <w:b w:val="false"/>
-                <w:bCs w:val="false"/>
-                <w:i w:val="false"/>
-                <w:iCs w:val="false"/>
-                <w:sz w:val="19"/>
-                <w:szCs w:val="19"/>
-              </w:rPr>
-              <w:t xml:space="preserve"/>
+              <w:t>Cột vector embedding trong bảng v_eval_ai.KnowledgeVectorChunks bị null cục bộ do code C# TextbookRepository chưa đẩy vector trực tiếp (Đã lên kế hoạch hoàn thành trước Defense 1.1).</w:t>
             </w:r>
           </w:p>
         </w:tc>
@@ -3681,16 +3035,7 @@
           </w:tcPr>
           <w:p>
             <w:r>
-              <w:rPr>
-                <w:rFonts w:ascii="Calibri" w:cs="Calibri" w:eastAsia="Calibri" w:hAnsi="Calibri"/>
-                <w:b w:val="false"/>
-                <w:bCs w:val="false"/>
-                <w:i w:val="false"/>
-                <w:iCs w:val="false"/>
-                <w:sz w:val="19"/>
-                <w:szCs w:val="19"/>
-              </w:rPr>
-              <w:t xml:space="preserve"/>
+              <w:t>3</w:t>
             </w:r>
           </w:p>
         </w:tc>
@@ -3712,16 +3057,7 @@
           </w:tcPr>
           <w:p>
             <w:r>
-              <w:rPr>
-                <w:rFonts w:ascii="Calibri" w:cs="Calibri" w:eastAsia="Calibri" w:hAnsi="Calibri"/>
-                <w:b w:val="false"/>
-                <w:bCs w:val="false"/>
-                <w:i w:val="false"/>
-                <w:iCs w:val="false"/>
-                <w:sz w:val="19"/>
-                <w:szCs w:val="19"/>
-              </w:rPr>
-              <w:t xml:space="preserve"/>
+              <w:t>SR-02</w:t>
             </w:r>
           </w:p>
         </w:tc>
@@ -3743,16 +3079,7 @@
           </w:tcPr>
           <w:p>
             <w:r>
-              <w:rPr>
-                <w:rFonts w:ascii="Calibri" w:cs="Calibri" w:eastAsia="Calibri" w:hAnsi="Calibri"/>
-                <w:b w:val="false"/>
-                <w:bCs w:val="false"/>
-                <w:i w:val="false"/>
-                <w:iCs w:val="false"/>
-                <w:sz w:val="19"/>
-                <w:szCs w:val="19"/>
-              </w:rPr>
-              <w:t xml:space="preserve"/>
+              <w:t>Sơ đồ kiến trúc tổng quan cũ thiếu liên kết liên dịch vụ gRPC sang Identity Service (:5155) và SSE Stream sang AI RAG Service (:8000) (Đã Fixed tại commit 82d5836).</w:t>
             </w:r>
           </w:p>
         </w:tc>
@@ -3776,16 +3103,7 @@
           </w:tcPr>
           <w:p>
             <w:r>
-              <w:rPr>
-                <w:rFonts w:ascii="Calibri" w:cs="Calibri" w:eastAsia="Calibri" w:hAnsi="Calibri"/>
-                <w:b w:val="false"/>
-                <w:bCs w:val="false"/>
-                <w:i w:val="false"/>
-                <w:iCs w:val="false"/>
-                <w:sz w:val="19"/>
-                <w:szCs w:val="19"/>
-              </w:rPr>
-              <w:t xml:space="preserve"/>
+              <w:t>4</w:t>
             </w:r>
           </w:p>
         </w:tc>
@@ -3807,16 +3125,7 @@
           </w:tcPr>
           <w:p>
             <w:r>
-              <w:rPr>
-                <w:rFonts w:ascii="Calibri" w:cs="Calibri" w:eastAsia="Calibri" w:hAnsi="Calibri"/>
-                <w:b w:val="false"/>
-                <w:bCs w:val="false"/>
-                <w:i w:val="false"/>
-                <w:iCs w:val="false"/>
-                <w:sz w:val="19"/>
-                <w:szCs w:val="19"/>
-              </w:rPr>
-              <w:t xml:space="preserve"/>
+              <w:t>SR-03</w:t>
             </w:r>
           </w:p>
         </w:tc>
@@ -3838,16 +3147,7 @@
           </w:tcPr>
           <w:p>
             <w:r>
-              <w:rPr>
-                <w:rFonts w:ascii="Calibri" w:cs="Calibri" w:eastAsia="Calibri" w:hAnsi="Calibri"/>
-                <w:b w:val="false"/>
-                <w:bCs w:val="false"/>
-                <w:i w:val="false"/>
-                <w:iCs w:val="false"/>
-                <w:sz w:val="19"/>
-                <w:szCs w:val="19"/>
-              </w:rPr>
-              <w:t xml:space="preserve"/>
+              <w:t>Sơ đồ Logical ERD cũ trong SDD chỉ có 11 bảng giả định sai tên so với 47 bảng và 74 quan hệ trong CSDL thực tế (Đã Fixed tại commit 82d5836).</w:t>
             </w:r>
           </w:p>
         </w:tc>
@@ -3871,16 +3171,7 @@
           </w:tcPr>
           <w:p>
             <w:r>
-              <w:rPr>
-                <w:rFonts w:ascii="Calibri" w:cs="Calibri" w:eastAsia="Calibri" w:hAnsi="Calibri"/>
-                <w:b w:val="false"/>
-                <w:bCs w:val="false"/>
-                <w:i w:val="false"/>
-                <w:iCs w:val="false"/>
-                <w:sz w:val="19"/>
-                <w:szCs w:val="19"/>
-              </w:rPr>
-              <w:t xml:space="preserve"/>
+              <w:t>5</w:t>
             </w:r>
           </w:p>
         </w:tc>
@@ -3902,16 +3193,7 @@
           </w:tcPr>
           <w:p>
             <w:r>
-              <w:rPr>
-                <w:rFonts w:ascii="Calibri" w:cs="Calibri" w:eastAsia="Calibri" w:hAnsi="Calibri"/>
-                <w:b w:val="false"/>
-                <w:bCs w:val="false"/>
-                <w:i w:val="false"/>
-                <w:iCs w:val="false"/>
-                <w:sz w:val="19"/>
-                <w:szCs w:val="19"/>
-              </w:rPr>
-              <w:t xml:space="preserve"/>
+              <w:t>SR-09</w:t>
             </w:r>
           </w:p>
         </w:tc>
@@ -3933,16 +3215,7 @@
           </w:tcPr>
           <w:p>
             <w:r>
-              <w:rPr>
-                <w:rFonts w:ascii="Calibri" w:cs="Calibri" w:eastAsia="Calibri" w:hAnsi="Calibri"/>
-                <w:b w:val="false"/>
-                <w:bCs w:val="false"/>
-                <w:i w:val="false"/>
-                <w:iCs w:val="false"/>
-                <w:sz w:val="19"/>
-                <w:szCs w:val="19"/>
-              </w:rPr>
-              <w:t xml:space="preserve"/>
+              <w:t>Toàn bộ 6 Core Flows đã có mã nguồn xử lý nghiệp vụ hoàn chỉnh nhưng bộ test tự động CI cần bổ sung đủ tối thiểu 66 functional test cases theo cam kết mục 09.3 (Đã Planned trước Defense 1.1).</w:t>
             </w:r>
           </w:p>
         </w:tc>
@@ -4205,6 +3478,96 @@
           </w:tcPr>
           <w:p>
             <w:r>
+              <w:t>4</w:t>
+            </w:r>
+          </w:p>
+        </w:tc>
+        <w:tc>
+          <w:tcPr>
+            <w:tcW w:type="dxa" w:w="1752"/>
+            <w:tcBorders>
+              <w:top w:val="single" w:color="D9D4CA" w:sz="4"/>
+              <w:left w:val="single" w:color="D9D4CA" w:sz="4"/>
+              <w:bottom w:val="single" w:color="D9D4CA" w:sz="4"/>
+              <w:right w:val="single" w:color="D9D4CA" w:sz="4"/>
+            </w:tcBorders>
+            <w:tcMar>
+              <w:top w:type="dxa" w:w="60"/>
+              <w:left w:type="dxa" w:w="80"/>
+              <w:bottom w:type="dxa" w:w="60"/>
+              <w:right w:type="dxa" w:w="80"/>
+            </w:tcMar>
+          </w:tcPr>
+          <w:p>
+            <w:r>
+              <w:t>2</w:t>
+            </w:r>
+          </w:p>
+        </w:tc>
+        <w:tc>
+          <w:tcPr>
+            <w:tcW w:type="dxa" w:w="1752"/>
+            <w:tcBorders>
+              <w:top w:val="single" w:color="D9D4CA" w:sz="4"/>
+              <w:left w:val="single" w:color="D9D4CA" w:sz="4"/>
+              <w:bottom w:val="single" w:color="D9D4CA" w:sz="4"/>
+              <w:right w:val="single" w:color="D9D4CA" w:sz="4"/>
+            </w:tcBorders>
+            <w:tcMar>
+              <w:top w:type="dxa" w:w="60"/>
+              <w:left w:type="dxa" w:w="80"/>
+              <w:bottom w:type="dxa" w:w="60"/>
+              <w:right w:type="dxa" w:w="80"/>
+            </w:tcMar>
+          </w:tcPr>
+          <w:p>
+            <w:r>
+              <w:t>0</w:t>
+            </w:r>
+          </w:p>
+        </w:tc>
+        <w:tc>
+          <w:tcPr>
+            <w:tcW w:type="dxa" w:w="1754"/>
+            <w:tcBorders>
+              <w:top w:val="single" w:color="D9D4CA" w:sz="4"/>
+              <w:left w:val="single" w:color="D9D4CA" w:sz="4"/>
+              <w:bottom w:val="single" w:color="D9D4CA" w:sz="4"/>
+              <w:right w:val="single" w:color="D9D4CA" w:sz="4"/>
+            </w:tcBorders>
+            <w:tcMar>
+              <w:top w:type="dxa" w:w="60"/>
+              <w:left w:type="dxa" w:w="80"/>
+              <w:bottom w:type="dxa" w:w="60"/>
+              <w:right w:type="dxa" w:w="80"/>
+            </w:tcMar>
+          </w:tcPr>
+          <w:p>
+            <w:r>
+              <w:t>2</w:t>
+            </w:r>
+          </w:p>
+        </w:tc>
+      </w:tr>
+      <w:tr>
+        <w:tc>
+          <w:tcPr>
+            <w:tcW w:type="dxa" w:w="2628"/>
+            <w:tcBorders>
+              <w:top w:val="single" w:color="D9D4CA" w:sz="4"/>
+              <w:left w:val="single" w:color="D9D4CA" w:sz="4"/>
+              <w:bottom w:val="single" w:color="D9D4CA" w:sz="4"/>
+              <w:right w:val="single" w:color="D9D4CA" w:sz="4"/>
+            </w:tcBorders>
+            <w:tcMar>
+              <w:top w:type="dxa" w:w="60"/>
+              <w:left w:type="dxa" w:w="80"/>
+              <w:bottom w:type="dxa" w:w="60"/>
+              <w:right w:type="dxa" w:w="80"/>
+            </w:tcMar>
+          </w:tcPr>
+          <w:p>
+            <w:r>
               <w:rPr>
                 <w:rFonts w:ascii="Calibri" w:cs="Calibri" w:eastAsia="Calibri" w:hAnsi="Calibri"/>
                 <w:b w:val="false"/>
@@ -4215,13 +3578,103 @@
                 <w:sz w:val="19"/>
                 <w:szCs w:val="19"/>
               </w:rPr>
-              <w:t xml:space="preserve"/>
+              <w:t xml:space="preserve">Medium</w:t>
             </w:r>
           </w:p>
         </w:tc>
         <w:tc>
           <w:tcPr>
             <w:tcW w:type="dxa" w:w="1752"/>
+            <w:tcBorders>
+              <w:top w:val="single" w:color="D9D4CA" w:sz="4"/>
+              <w:left w:val="single" w:color="D9D4CA" w:sz="4"/>
+              <w:bottom w:val="single" w:color="D9D4CA" w:sz="4"/>
+              <w:right w:val="single" w:color="D9D4CA" w:sz="4"/>
+            </w:tcBorders>
+            <w:tcMar>
+              <w:top w:type="dxa" w:w="60"/>
+              <w:left w:type="dxa" w:w="80"/>
+              <w:bottom w:type="dxa" w:w="60"/>
+              <w:right w:type="dxa" w:w="80"/>
+            </w:tcMar>
+          </w:tcPr>
+          <w:p>
+            <w:r>
+              <w:t>5</w:t>
+            </w:r>
+          </w:p>
+        </w:tc>
+        <w:tc>
+          <w:tcPr>
+            <w:tcW w:type="dxa" w:w="1752"/>
+            <w:tcBorders>
+              <w:top w:val="single" w:color="D9D4CA" w:sz="4"/>
+              <w:left w:val="single" w:color="D9D4CA" w:sz="4"/>
+              <w:bottom w:val="single" w:color="D9D4CA" w:sz="4"/>
+              <w:right w:val="single" w:color="D9D4CA" w:sz="4"/>
+            </w:tcBorders>
+            <w:tcMar>
+              <w:top w:type="dxa" w:w="60"/>
+              <w:left w:type="dxa" w:w="80"/>
+              <w:bottom w:type="dxa" w:w="60"/>
+              <w:right w:type="dxa" w:w="80"/>
+            </w:tcMar>
+          </w:tcPr>
+          <w:p>
+            <w:r>
+              <w:t>0</w:t>
+            </w:r>
+          </w:p>
+        </w:tc>
+        <w:tc>
+          <w:tcPr>
+            <w:tcW w:type="dxa" w:w="1752"/>
+            <w:tcBorders>
+              <w:top w:val="single" w:color="D9D4CA" w:sz="4"/>
+              <w:left w:val="single" w:color="D9D4CA" w:sz="4"/>
+              <w:bottom w:val="single" w:color="D9D4CA" w:sz="4"/>
+              <w:right w:val="single" w:color="D9D4CA" w:sz="4"/>
+            </w:tcBorders>
+            <w:tcMar>
+              <w:top w:type="dxa" w:w="60"/>
+              <w:left w:type="dxa" w:w="80"/>
+              <w:bottom w:type="dxa" w:w="60"/>
+              <w:right w:type="dxa" w:w="80"/>
+            </w:tcMar>
+          </w:tcPr>
+          <w:p>
+            <w:r>
+              <w:t>1</w:t>
+            </w:r>
+          </w:p>
+        </w:tc>
+        <w:tc>
+          <w:tcPr>
+            <w:tcW w:type="dxa" w:w="1754"/>
+            <w:tcBorders>
+              <w:top w:val="single" w:color="D9D4CA" w:sz="4"/>
+              <w:left w:val="single" w:color="D9D4CA" w:sz="4"/>
+              <w:bottom w:val="single" w:color="D9D4CA" w:sz="4"/>
+              <w:right w:val="single" w:color="D9D4CA" w:sz="4"/>
+            </w:tcBorders>
+            <w:tcMar>
+              <w:top w:type="dxa" w:w="60"/>
+              <w:left w:type="dxa" w:w="80"/>
+              <w:bottom w:type="dxa" w:w="60"/>
+              <w:right w:type="dxa" w:w="80"/>
+            </w:tcMar>
+          </w:tcPr>
+          <w:p>
+            <w:r>
+              <w:t>4</w:t>
+            </w:r>
+          </w:p>
+        </w:tc>
+      </w:tr>
+      <w:tr>
+        <w:tc>
+          <w:tcPr>
+            <w:tcW w:type="dxa" w:w="2628"/>
             <w:tcBorders>
               <w:top w:val="single" w:color="D9D4CA" w:sz="4"/>
               <w:left w:val="single" w:color="D9D4CA" w:sz="4"/>
@@ -4247,7 +3700,7 @@
                 <w:sz w:val="19"/>
                 <w:szCs w:val="19"/>
               </w:rPr>
-              <w:t xml:space="preserve"/>
+              <w:t xml:space="preserve">Low</w:t>
             </w:r>
           </w:p>
         </w:tc>
@@ -4269,17 +3722,51 @@
           </w:tcPr>
           <w:p>
             <w:r>
-              <w:rPr>
-                <w:rFonts w:ascii="Calibri" w:cs="Calibri" w:eastAsia="Calibri" w:hAnsi="Calibri"/>
-                <w:b w:val="false"/>
-                <w:bCs w:val="false"/>
-                <w:i/>
-                <w:iCs/>
-                <w:color w:val="666666"/>
-                <w:sz w:val="19"/>
-                <w:szCs w:val="19"/>
-              </w:rPr>
-              <w:t xml:space="preserve"/>
+              <w:t>1</w:t>
+            </w:r>
+          </w:p>
+        </w:tc>
+        <w:tc>
+          <w:tcPr>
+            <w:tcW w:type="dxa" w:w="1752"/>
+            <w:tcBorders>
+              <w:top w:val="single" w:color="D9D4CA" w:sz="4"/>
+              <w:left w:val="single" w:color="D9D4CA" w:sz="4"/>
+              <w:bottom w:val="single" w:color="D9D4CA" w:sz="4"/>
+              <w:right w:val="single" w:color="D9D4CA" w:sz="4"/>
+            </w:tcBorders>
+            <w:tcMar>
+              <w:top w:type="dxa" w:w="60"/>
+              <w:left w:type="dxa" w:w="80"/>
+              <w:bottom w:type="dxa" w:w="60"/>
+              <w:right w:type="dxa" w:w="80"/>
+            </w:tcMar>
+          </w:tcPr>
+          <w:p>
+            <w:r>
+              <w:t>1</w:t>
+            </w:r>
+          </w:p>
+        </w:tc>
+        <w:tc>
+          <w:tcPr>
+            <w:tcW w:type="dxa" w:w="1752"/>
+            <w:tcBorders>
+              <w:top w:val="single" w:color="D9D4CA" w:sz="4"/>
+              <w:left w:val="single" w:color="D9D4CA" w:sz="4"/>
+              <w:bottom w:val="single" w:color="D9D4CA" w:sz="4"/>
+              <w:right w:val="single" w:color="D9D4CA" w:sz="4"/>
+            </w:tcBorders>
+            <w:tcMar>
+              <w:top w:type="dxa" w:w="60"/>
+              <w:left w:type="dxa" w:w="80"/>
+              <w:bottom w:type="dxa" w:w="60"/>
+              <w:right w:type="dxa" w:w="80"/>
+            </w:tcMar>
+          </w:tcPr>
+          <w:p>
+            <w:r>
+              <w:t>0</w:t>
             </w:r>
           </w:p>
         </w:tc>
@@ -4301,341 +3788,7 @@
           </w:tcPr>
           <w:p>
             <w:r>
-              <w:rPr>
-                <w:rFonts w:ascii="Calibri" w:cs="Calibri" w:eastAsia="Calibri" w:hAnsi="Calibri"/>
-                <w:b w:val="false"/>
-                <w:bCs w:val="false"/>
-                <w:i/>
-                <w:iCs/>
-                <w:color w:val="666666"/>
-                <w:sz w:val="19"/>
-                <w:szCs w:val="19"/>
-              </w:rPr>
-              <w:t xml:space="preserve"/>
-            </w:r>
-          </w:p>
-        </w:tc>
-      </w:tr>
-      <w:tr>
-        <w:tc>
-          <w:tcPr>
-            <w:tcW w:type="dxa" w:w="2628"/>
-            <w:tcBorders>
-              <w:top w:val="single" w:color="D9D4CA" w:sz="4"/>
-              <w:left w:val="single" w:color="D9D4CA" w:sz="4"/>
-              <w:bottom w:val="single" w:color="D9D4CA" w:sz="4"/>
-              <w:right w:val="single" w:color="D9D4CA" w:sz="4"/>
-            </w:tcBorders>
-            <w:tcMar>
-              <w:top w:type="dxa" w:w="60"/>
-              <w:left w:type="dxa" w:w="80"/>
-              <w:bottom w:type="dxa" w:w="60"/>
-              <w:right w:type="dxa" w:w="80"/>
-            </w:tcMar>
-          </w:tcPr>
-          <w:p>
-            <w:r>
-              <w:rPr>
-                <w:rFonts w:ascii="Calibri" w:cs="Calibri" w:eastAsia="Calibri" w:hAnsi="Calibri"/>
-                <w:b w:val="false"/>
-                <w:bCs w:val="false"/>
-                <w:i/>
-                <w:iCs/>
-                <w:color w:val="666666"/>
-                <w:sz w:val="19"/>
-                <w:szCs w:val="19"/>
-              </w:rPr>
-              <w:t xml:space="preserve">Medium</w:t>
-            </w:r>
-          </w:p>
-        </w:tc>
-        <w:tc>
-          <w:tcPr>
-            <w:tcW w:type="dxa" w:w="1752"/>
-            <w:tcBorders>
-              <w:top w:val="single" w:color="D9D4CA" w:sz="4"/>
-              <w:left w:val="single" w:color="D9D4CA" w:sz="4"/>
-              <w:bottom w:val="single" w:color="D9D4CA" w:sz="4"/>
-              <w:right w:val="single" w:color="D9D4CA" w:sz="4"/>
-            </w:tcBorders>
-            <w:tcMar>
-              <w:top w:type="dxa" w:w="60"/>
-              <w:left w:type="dxa" w:w="80"/>
-              <w:bottom w:type="dxa" w:w="60"/>
-              <w:right w:type="dxa" w:w="80"/>
-            </w:tcMar>
-          </w:tcPr>
-          <w:p>
-            <w:r>
-              <w:rPr>
-                <w:rFonts w:ascii="Calibri" w:cs="Calibri" w:eastAsia="Calibri" w:hAnsi="Calibri"/>
-                <w:b w:val="false"/>
-                <w:bCs w:val="false"/>
-                <w:i/>
-                <w:iCs/>
-                <w:color w:val="666666"/>
-                <w:sz w:val="19"/>
-                <w:szCs w:val="19"/>
-              </w:rPr>
-              <w:t xml:space="preserve"/>
-            </w:r>
-          </w:p>
-        </w:tc>
-        <w:tc>
-          <w:tcPr>
-            <w:tcW w:type="dxa" w:w="1752"/>
-            <w:tcBorders>
-              <w:top w:val="single" w:color="D9D4CA" w:sz="4"/>
-              <w:left w:val="single" w:color="D9D4CA" w:sz="4"/>
-              <w:bottom w:val="single" w:color="D9D4CA" w:sz="4"/>
-              <w:right w:val="single" w:color="D9D4CA" w:sz="4"/>
-            </w:tcBorders>
-            <w:tcMar>
-              <w:top w:type="dxa" w:w="60"/>
-              <w:left w:type="dxa" w:w="80"/>
-              <w:bottom w:type="dxa" w:w="60"/>
-              <w:right w:type="dxa" w:w="80"/>
-            </w:tcMar>
-          </w:tcPr>
-          <w:p>
-            <w:r>
-              <w:rPr>
-                <w:rFonts w:ascii="Calibri" w:cs="Calibri" w:eastAsia="Calibri" w:hAnsi="Calibri"/>
-                <w:b w:val="false"/>
-                <w:bCs w:val="false"/>
-                <w:i/>
-                <w:iCs/>
-                <w:color w:val="666666"/>
-                <w:sz w:val="19"/>
-                <w:szCs w:val="19"/>
-              </w:rPr>
-              <w:t xml:space="preserve"/>
-            </w:r>
-          </w:p>
-        </w:tc>
-        <w:tc>
-          <w:tcPr>
-            <w:tcW w:type="dxa" w:w="1752"/>
-            <w:tcBorders>
-              <w:top w:val="single" w:color="D9D4CA" w:sz="4"/>
-              <w:left w:val="single" w:color="D9D4CA" w:sz="4"/>
-              <w:bottom w:val="single" w:color="D9D4CA" w:sz="4"/>
-              <w:right w:val="single" w:color="D9D4CA" w:sz="4"/>
-            </w:tcBorders>
-            <w:tcMar>
-              <w:top w:type="dxa" w:w="60"/>
-              <w:left w:type="dxa" w:w="80"/>
-              <w:bottom w:type="dxa" w:w="60"/>
-              <w:right w:type="dxa" w:w="80"/>
-            </w:tcMar>
-          </w:tcPr>
-          <w:p>
-            <w:r>
-              <w:rPr>
-                <w:rFonts w:ascii="Calibri" w:cs="Calibri" w:eastAsia="Calibri" w:hAnsi="Calibri"/>
-                <w:b w:val="false"/>
-                <w:bCs w:val="false"/>
-                <w:i/>
-                <w:iCs/>
-                <w:color w:val="666666"/>
-                <w:sz w:val="19"/>
-                <w:szCs w:val="19"/>
-              </w:rPr>
-              <w:t xml:space="preserve"/>
-            </w:r>
-          </w:p>
-        </w:tc>
-        <w:tc>
-          <w:tcPr>
-            <w:tcW w:type="dxa" w:w="1754"/>
-            <w:tcBorders>
-              <w:top w:val="single" w:color="D9D4CA" w:sz="4"/>
-              <w:left w:val="single" w:color="D9D4CA" w:sz="4"/>
-              <w:bottom w:val="single" w:color="D9D4CA" w:sz="4"/>
-              <w:right w:val="single" w:color="D9D4CA" w:sz="4"/>
-            </w:tcBorders>
-            <w:tcMar>
-              <w:top w:type="dxa" w:w="60"/>
-              <w:left w:type="dxa" w:w="80"/>
-              <w:bottom w:type="dxa" w:w="60"/>
-              <w:right w:type="dxa" w:w="80"/>
-            </w:tcMar>
-          </w:tcPr>
-          <w:p>
-            <w:r>
-              <w:rPr>
-                <w:rFonts w:ascii="Calibri" w:cs="Calibri" w:eastAsia="Calibri" w:hAnsi="Calibri"/>
-                <w:b w:val="false"/>
-                <w:bCs w:val="false"/>
-                <w:i/>
-                <w:iCs/>
-                <w:color w:val="666666"/>
-                <w:sz w:val="19"/>
-                <w:szCs w:val="19"/>
-              </w:rPr>
-              <w:t xml:space="preserve"/>
-            </w:r>
-          </w:p>
-        </w:tc>
-      </w:tr>
-      <w:tr>
-        <w:tc>
-          <w:tcPr>
-            <w:tcW w:type="dxa" w:w="2628"/>
-            <w:tcBorders>
-              <w:top w:val="single" w:color="D9D4CA" w:sz="4"/>
-              <w:left w:val="single" w:color="D9D4CA" w:sz="4"/>
-              <w:bottom w:val="single" w:color="D9D4CA" w:sz="4"/>
-              <w:right w:val="single" w:color="D9D4CA" w:sz="4"/>
-            </w:tcBorders>
-            <w:tcMar>
-              <w:top w:type="dxa" w:w="60"/>
-              <w:left w:type="dxa" w:w="80"/>
-              <w:bottom w:type="dxa" w:w="60"/>
-              <w:right w:type="dxa" w:w="80"/>
-            </w:tcMar>
-          </w:tcPr>
-          <w:p>
-            <w:r>
-              <w:rPr>
-                <w:rFonts w:ascii="Calibri" w:cs="Calibri" w:eastAsia="Calibri" w:hAnsi="Calibri"/>
-                <w:b w:val="false"/>
-                <w:bCs w:val="false"/>
-                <w:i/>
-                <w:iCs/>
-                <w:color w:val="666666"/>
-                <w:sz w:val="19"/>
-                <w:szCs w:val="19"/>
-              </w:rPr>
-              <w:t xml:space="preserve">Low</w:t>
-            </w:r>
-          </w:p>
-        </w:tc>
-        <w:tc>
-          <w:tcPr>
-            <w:tcW w:type="dxa" w:w="1752"/>
-            <w:tcBorders>
-              <w:top w:val="single" w:color="D9D4CA" w:sz="4"/>
-              <w:left w:val="single" w:color="D9D4CA" w:sz="4"/>
-              <w:bottom w:val="single" w:color="D9D4CA" w:sz="4"/>
-              <w:right w:val="single" w:color="D9D4CA" w:sz="4"/>
-            </w:tcBorders>
-            <w:tcMar>
-              <w:top w:type="dxa" w:w="60"/>
-              <w:left w:type="dxa" w:w="80"/>
-              <w:bottom w:type="dxa" w:w="60"/>
-              <w:right w:type="dxa" w:w="80"/>
-            </w:tcMar>
-          </w:tcPr>
-          <w:p>
-            <w:r>
-              <w:rPr>
-                <w:rFonts w:ascii="Calibri" w:cs="Calibri" w:eastAsia="Calibri" w:hAnsi="Calibri"/>
-                <w:b w:val="false"/>
-                <w:bCs w:val="false"/>
-                <w:i/>
-                <w:iCs/>
-                <w:color w:val="666666"/>
-                <w:sz w:val="19"/>
-                <w:szCs w:val="19"/>
-              </w:rPr>
-              <w:t xml:space="preserve"/>
-            </w:r>
-          </w:p>
-        </w:tc>
-        <w:tc>
-          <w:tcPr>
-            <w:tcW w:type="dxa" w:w="1752"/>
-            <w:tcBorders>
-              <w:top w:val="single" w:color="D9D4CA" w:sz="4"/>
-              <w:left w:val="single" w:color="D9D4CA" w:sz="4"/>
-              <w:bottom w:val="single" w:color="D9D4CA" w:sz="4"/>
-              <w:right w:val="single" w:color="D9D4CA" w:sz="4"/>
-            </w:tcBorders>
-            <w:tcMar>
-              <w:top w:type="dxa" w:w="60"/>
-              <w:left w:type="dxa" w:w="80"/>
-              <w:bottom w:type="dxa" w:w="60"/>
-              <w:right w:type="dxa" w:w="80"/>
-            </w:tcMar>
-          </w:tcPr>
-          <w:p>
-            <w:r>
-              <w:rPr>
-                <w:rFonts w:ascii="Calibri" w:cs="Calibri" w:eastAsia="Calibri" w:hAnsi="Calibri"/>
-                <w:b w:val="false"/>
-                <w:bCs w:val="false"/>
-                <w:i/>
-                <w:iCs/>
-                <w:color w:val="666666"/>
-                <w:sz w:val="19"/>
-                <w:szCs w:val="19"/>
-              </w:rPr>
-              <w:t xml:space="preserve"/>
-            </w:r>
-          </w:p>
-        </w:tc>
-        <w:tc>
-          <w:tcPr>
-            <w:tcW w:type="dxa" w:w="1752"/>
-            <w:tcBorders>
-              <w:top w:val="single" w:color="D9D4CA" w:sz="4"/>
-              <w:left w:val="single" w:color="D9D4CA" w:sz="4"/>
-              <w:bottom w:val="single" w:color="D9D4CA" w:sz="4"/>
-              <w:right w:val="single" w:color="D9D4CA" w:sz="4"/>
-            </w:tcBorders>
-            <w:tcMar>
-              <w:top w:type="dxa" w:w="60"/>
-              <w:left w:type="dxa" w:w="80"/>
-              <w:bottom w:type="dxa" w:w="60"/>
-              <w:right w:type="dxa" w:w="80"/>
-            </w:tcMar>
-          </w:tcPr>
-          <w:p>
-            <w:r>
-              <w:rPr>
-                <w:rFonts w:ascii="Calibri" w:cs="Calibri" w:eastAsia="Calibri" w:hAnsi="Calibri"/>
-                <w:b w:val="false"/>
-                <w:bCs w:val="false"/>
-                <w:i/>
-                <w:iCs/>
-                <w:color w:val="666666"/>
-                <w:sz w:val="19"/>
-                <w:szCs w:val="19"/>
-              </w:rPr>
-              <w:t xml:space="preserve"/>
-            </w:r>
-          </w:p>
-        </w:tc>
-        <w:tc>
-          <w:tcPr>
-            <w:tcW w:type="dxa" w:w="1754"/>
-            <w:tcBorders>
-              <w:top w:val="single" w:color="D9D4CA" w:sz="4"/>
-              <w:left w:val="single" w:color="D9D4CA" w:sz="4"/>
-              <w:bottom w:val="single" w:color="D9D4CA" w:sz="4"/>
-              <w:right w:val="single" w:color="D9D4CA" w:sz="4"/>
-            </w:tcBorders>
-            <w:tcMar>
-              <w:top w:type="dxa" w:w="60"/>
-              <w:left w:type="dxa" w:w="80"/>
-              <w:bottom w:type="dxa" w:w="60"/>
-              <w:right w:type="dxa" w:w="80"/>
-            </w:tcMar>
-          </w:tcPr>
-          <w:p>
-            <w:r>
-              <w:rPr>
-                <w:rFonts w:ascii="Calibri" w:cs="Calibri" w:eastAsia="Calibri" w:hAnsi="Calibri"/>
-                <w:b w:val="false"/>
-                <w:bCs w:val="false"/>
-                <w:i/>
-                <w:iCs/>
-                <w:color w:val="666666"/>
-                <w:sz w:val="19"/>
-                <w:szCs w:val="19"/>
-              </w:rPr>
-              <w:t xml:space="preserve"/>
+              <w:t>0</w:t>
             </w:r>
           </w:p>
         </w:tc>

</xml_diff>